<commit_message>
TRANSACTION dropdown working 6/16/26
</commit_message>
<xml_diff>
--- a/help/Js to php exaples.docx
+++ b/help/Js to php exaples.docx
@@ -24,6 +24,18 @@
         <w:t>exaples</w:t>
       </w:r>
       <w:proofErr w:type="spellEnd"/>
+      <w:r>
+        <w:br/>
+      </w:r>
+      <w:r>
+        <w:br/>
+      </w:r>
+      <w:r>
+        <w:rPr>
+          <w:highlight w:val="lightGray"/>
+        </w:rPr>
+        <w:t>Can you give me an example with a form input containing a transaction code, a username, input text field, and input date feel, a select field with options, a submit button and the JavaScript function that’s a bit submit to a PHP program, and an example of the PHP program updating a My SQL database and returning a completion code and completion message in JSON string</w:t>
+      </w:r>
       <w:r>
         <w:br/>
       </w:r>
@@ -1795,11 +1807,1515 @@
       <w:proofErr w:type="gramEnd"/>
     </w:p>
     <w:p>
-      <w:r>
+      <w:pPr>
         <w:rPr>
           <w:color w:val="EE0000"/>
         </w:rPr>
+      </w:pPr>
+      <w:r>
+        <w:rPr>
+          <w:color w:val="EE0000"/>
+          <w:highlight w:val="lightGray"/>
+        </w:rPr>
         <w:t>Friday 6/12</w:t>
+      </w:r>
+      <w:r>
+        <w:rPr>
+          <w:color w:val="EE0000"/>
+          <w:highlight w:val="lightGray"/>
+        </w:rPr>
+        <w:t>=======================================================================</w:t>
+      </w:r>
+      <w:r>
+        <w:rPr>
+          <w:color w:val="EE0000"/>
+          <w:highlight w:val="lightGray"/>
+        </w:rPr>
+        <w:br/>
+      </w:r>
+      <w:r>
+        <w:rPr>
+          <w:color w:val="EE0000"/>
+          <w:highlight w:val="lightGray"/>
+        </w:rPr>
+        <w:t>Add update insert and delete based on transaction code entered</w:t>
+      </w:r>
+    </w:p>
+    <w:p>
+      <w:pPr>
+        <w:tabs>
+          <w:tab w:val="left" w:pos="560"/>
+          <w:tab w:val="left" w:pos="1120"/>
+          <w:tab w:val="left" w:pos="1680"/>
+          <w:tab w:val="left" w:pos="2240"/>
+          <w:tab w:val="left" w:pos="2800"/>
+          <w:tab w:val="left" w:pos="3360"/>
+          <w:tab w:val="left" w:pos="3920"/>
+          <w:tab w:val="left" w:pos="4480"/>
+          <w:tab w:val="left" w:pos="5040"/>
+          <w:tab w:val="left" w:pos="5600"/>
+          <w:tab w:val="left" w:pos="6160"/>
+          <w:tab w:val="left" w:pos="6720"/>
+        </w:tabs>
+        <w:autoSpaceDE w:val="0"/>
+        <w:autoSpaceDN w:val="0"/>
+        <w:adjustRightInd w:val="0"/>
+        <w:spacing w:line="592" w:lineRule="exact"/>
+        <w:rPr>
+          <w:rFonts w:ascii="Times New Roman" w:hAnsi="Times New Roman" w:cs="Times New Roman"/>
+          <w:color w:val="000000"/>
+          <w:kern w:val="1"/>
+          <w:sz w:val="40"/>
+          <w:szCs w:val="40"/>
+        </w:rPr>
+      </w:pPr>
+      <w:r>
+        <w:rPr>
+          <w:rFonts w:ascii="Times New Roman" w:hAnsi="Times New Roman" w:cs="Times New Roman"/>
+          <w:b/>
+          <w:bCs/>
+          <w:color w:val="000000"/>
+          <w:kern w:val="1"/>
+          <w:sz w:val="40"/>
+          <w:szCs w:val="40"/>
+        </w:rPr>
+        <w:t>Updated Full Example with INSERT, UPDATE, and DELETE</w:t>
+      </w:r>
+    </w:p>
+    <w:p>
+      <w:r>
+        <w:rPr>
+          <w:rFonts w:ascii="Times New Roman" w:hAnsi="Times New Roman" w:cs="Times New Roman"/>
+          <w:b/>
+          <w:bCs/>
+          <w:color w:val="000000"/>
+          <w:spacing w:val="-2"/>
+          <w:kern w:val="1"/>
+          <w:sz w:val="48"/>
+          <w:szCs w:val="48"/>
+        </w:rPr>
+        <w:t>1. Enhanced HTML + JavaScript (</w:t>
+      </w:r>
+      <w:r>
+        <w:rPr>
+          <w:rFonts w:ascii="System Font" w:hAnsi="System Font" w:cs="System Font"/>
+          <w:color w:val="FF5400"/>
+          <w:spacing w:val="-2"/>
+          <w:kern w:val="1"/>
+          <w:sz w:val="48"/>
+          <w:szCs w:val="48"/>
+        </w:rPr>
+        <w:t>index.html</w:t>
+      </w:r>
+      <w:r>
+        <w:rPr>
+          <w:rFonts w:ascii="Times New Roman" w:hAnsi="Times New Roman" w:cs="Times New Roman"/>
+          <w:b/>
+          <w:bCs/>
+          <w:color w:val="000000"/>
+          <w:spacing w:val="-2"/>
+          <w:kern w:val="1"/>
+          <w:sz w:val="48"/>
+          <w:szCs w:val="48"/>
+        </w:rPr>
+        <w:t>)</w:t>
+      </w:r>
+    </w:p>
+    <w:p>
+      <w:r>
+        <w:t>&lt;!DOCTYPE html&gt;</w:t>
+      </w:r>
+    </w:p>
+    <w:p>
+      <w:r>
+        <w:t>&lt;html lang="</w:t>
+      </w:r>
+      <w:proofErr w:type="spellStart"/>
+      <w:r>
+        <w:t>en</w:t>
+      </w:r>
+      <w:proofErr w:type="spellEnd"/>
+      <w:r>
+        <w:t>"&gt;</w:t>
+      </w:r>
+    </w:p>
+    <w:p>
+      <w:r>
+        <w:t>&lt;head&gt;</w:t>
+      </w:r>
+    </w:p>
+    <w:p>
+      <w:r>
+        <w:t xml:space="preserve">    &lt;meta charset="UTF-8"&gt;</w:t>
+      </w:r>
+    </w:p>
+    <w:p>
+      <w:r>
+        <w:t xml:space="preserve">    &lt;meta name="viewport" content="width=device-width, initial-scale=1.0"&gt;</w:t>
+      </w:r>
+    </w:p>
+    <w:p>
+      <w:r>
+        <w:t xml:space="preserve">    &lt;title&gt;Transaction CRUD Example&lt;/title&gt;</w:t>
+      </w:r>
+    </w:p>
+    <w:p>
+      <w:r>
+        <w:t xml:space="preserve">    &lt;style&gt;</w:t>
+      </w:r>
+    </w:p>
+    <w:p>
+      <w:r>
+        <w:t xml:space="preserve">        body </w:t>
+      </w:r>
+      <w:proofErr w:type="gramStart"/>
+      <w:r>
+        <w:t>{ font</w:t>
+      </w:r>
+      <w:proofErr w:type="gramEnd"/>
+      <w:r>
+        <w:t>-family: Arial, sans-serif; max-width: 700px; margin: 40px auto</w:t>
+      </w:r>
+      <w:proofErr w:type="gramStart"/>
+      <w:r>
+        <w:t>; }</w:t>
+      </w:r>
+      <w:proofErr w:type="gramEnd"/>
+    </w:p>
+    <w:p>
+      <w:r>
+        <w:t xml:space="preserve">        form </w:t>
+      </w:r>
+      <w:proofErr w:type="gramStart"/>
+      <w:r>
+        <w:t>{ display</w:t>
+      </w:r>
+      <w:proofErr w:type="gramEnd"/>
+      <w:r>
+        <w:t>: grid; gap: 15px</w:t>
+      </w:r>
+      <w:proofErr w:type="gramStart"/>
+      <w:r>
+        <w:t>; }</w:t>
+      </w:r>
+      <w:proofErr w:type="gramEnd"/>
+    </w:p>
+    <w:p>
+      <w:r>
+        <w:t xml:space="preserve">        label </w:t>
+      </w:r>
+      <w:proofErr w:type="gramStart"/>
+      <w:r>
+        <w:t>{ font</w:t>
+      </w:r>
+      <w:proofErr w:type="gramEnd"/>
+      <w:r>
+        <w:t>-weight: bold</w:t>
+      </w:r>
+      <w:proofErr w:type="gramStart"/>
+      <w:r>
+        <w:t>; }</w:t>
+      </w:r>
+      <w:proofErr w:type="gramEnd"/>
+    </w:p>
+    <w:p>
+      <w:r>
+        <w:t xml:space="preserve">        input, select, button </w:t>
+      </w:r>
+      <w:proofErr w:type="gramStart"/>
+      <w:r>
+        <w:t>{ padding</w:t>
+      </w:r>
+      <w:proofErr w:type="gramEnd"/>
+      <w:r>
+        <w:t>: 10px; font-size: 16px</w:t>
+      </w:r>
+      <w:proofErr w:type="gramStart"/>
+      <w:r>
+        <w:t>; }</w:t>
+      </w:r>
+      <w:proofErr w:type="gramEnd"/>
+    </w:p>
+    <w:p>
+      <w:r>
+        <w:t xml:space="preserve">        button </w:t>
+      </w:r>
+      <w:proofErr w:type="gramStart"/>
+      <w:r>
+        <w:t>{ background</w:t>
+      </w:r>
+      <w:proofErr w:type="gramEnd"/>
+      <w:r>
+        <w:t>: #007bff; color: white; border: none; cursor: pointer</w:t>
+      </w:r>
+      <w:proofErr w:type="gramStart"/>
+      <w:r>
+        <w:t>; }</w:t>
+      </w:r>
+      <w:proofErr w:type="gramEnd"/>
+    </w:p>
+    <w:p>
+      <w:r>
+        <w:t xml:space="preserve">        </w:t>
+      </w:r>
+      <w:proofErr w:type="spellStart"/>
+      <w:proofErr w:type="gramStart"/>
+      <w:r>
+        <w:t>button:hover</w:t>
+      </w:r>
+      <w:proofErr w:type="spellEnd"/>
+      <w:proofErr w:type="gramEnd"/>
+      <w:r>
+        <w:t xml:space="preserve"> </w:t>
+      </w:r>
+      <w:proofErr w:type="gramStart"/>
+      <w:r>
+        <w:t>{ background</w:t>
+      </w:r>
+      <w:proofErr w:type="gramEnd"/>
+      <w:r>
+        <w:t>: #0056b3</w:t>
+      </w:r>
+      <w:proofErr w:type="gramStart"/>
+      <w:r>
+        <w:t>; }</w:t>
+      </w:r>
+      <w:proofErr w:type="gramEnd"/>
+    </w:p>
+    <w:p>
+      <w:r>
+        <w:t xml:space="preserve">        </w:t>
+      </w:r>
+      <w:proofErr w:type="gramStart"/>
+      <w:r>
+        <w:t>.delete</w:t>
+      </w:r>
+      <w:proofErr w:type="gramEnd"/>
+      <w:r>
+        <w:t>-</w:t>
+      </w:r>
+      <w:proofErr w:type="spellStart"/>
+      <w:r>
+        <w:t>btn</w:t>
+      </w:r>
+      <w:proofErr w:type="spellEnd"/>
+      <w:r>
+        <w:t xml:space="preserve"> </w:t>
+      </w:r>
+      <w:proofErr w:type="gramStart"/>
+      <w:r>
+        <w:t>{ background</w:t>
+      </w:r>
+      <w:proofErr w:type="gramEnd"/>
+      <w:r>
+        <w:t>: #dc3545</w:t>
+      </w:r>
+      <w:proofErr w:type="gramStart"/>
+      <w:r>
+        <w:t>; }</w:t>
+      </w:r>
+      <w:proofErr w:type="gramEnd"/>
+    </w:p>
+    <w:p>
+      <w:r>
+        <w:t xml:space="preserve">        </w:t>
+      </w:r>
+      <w:proofErr w:type="gramStart"/>
+      <w:r>
+        <w:t>.</w:t>
+      </w:r>
+      <w:proofErr w:type="spellStart"/>
+      <w:r>
+        <w:t>delete</w:t>
+      </w:r>
+      <w:proofErr w:type="gramEnd"/>
+      <w:r>
+        <w:t>-</w:t>
+      </w:r>
+      <w:proofErr w:type="gramStart"/>
+      <w:r>
+        <w:t>btn:hover</w:t>
+      </w:r>
+      <w:proofErr w:type="spellEnd"/>
+      <w:proofErr w:type="gramEnd"/>
+      <w:r>
+        <w:t xml:space="preserve"> </w:t>
+      </w:r>
+      <w:proofErr w:type="gramStart"/>
+      <w:r>
+        <w:t>{ background</w:t>
+      </w:r>
+      <w:proofErr w:type="gramEnd"/>
+      <w:r>
+        <w:t>: #c82333</w:t>
+      </w:r>
+      <w:proofErr w:type="gramStart"/>
+      <w:r>
+        <w:t>; }</w:t>
+      </w:r>
+      <w:proofErr w:type="gramEnd"/>
+    </w:p>
+    <w:p>
+      <w:r>
+        <w:t xml:space="preserve">        #result </w:t>
+      </w:r>
+      <w:proofErr w:type="gramStart"/>
+      <w:r>
+        <w:t>{ margin</w:t>
+      </w:r>
+      <w:proofErr w:type="gramEnd"/>
+      <w:r>
+        <w:t>-top: 20px; padding: 15px; border: 1px solid #ddd</w:t>
+      </w:r>
+      <w:proofErr w:type="gramStart"/>
+      <w:r>
+        <w:t>; }</w:t>
+      </w:r>
+      <w:proofErr w:type="gramEnd"/>
+    </w:p>
+    <w:p>
+      <w:r>
+        <w:t xml:space="preserve">    &lt;/style&gt;</w:t>
+      </w:r>
+    </w:p>
+    <w:p>
+      <w:r>
+        <w:t>&lt;/head&gt;</w:t>
+      </w:r>
+    </w:p>
+    <w:p>
+      <w:r>
+        <w:t>&lt;body&gt;</w:t>
+      </w:r>
+    </w:p>
+    <w:p/>
+    <w:p>
+      <w:r>
+        <w:t>&lt;h2&gt;Transaction CRUD Operations&lt;/h2&gt;</w:t>
+      </w:r>
+    </w:p>
+    <w:p/>
+    <w:p>
+      <w:r>
+        <w:t>&lt;form id="</w:t>
+      </w:r>
+      <w:proofErr w:type="spellStart"/>
+      <w:r>
+        <w:t>transactionForm</w:t>
+      </w:r>
+      <w:proofErr w:type="spellEnd"/>
+      <w:r>
+        <w:t>"&gt;</w:t>
+      </w:r>
+    </w:p>
+    <w:p>
+      <w:r>
+        <w:t xml:space="preserve">    &lt;div&gt;</w:t>
+      </w:r>
+    </w:p>
+    <w:p>
+      <w:r>
+        <w:t xml:space="preserve">        &lt;label&gt;Operation:&lt;/label&gt;</w:t>
+      </w:r>
+    </w:p>
+    <w:p>
+      <w:r>
+        <w:t xml:space="preserve">        &lt;select id="operation" name="operation" required&gt;</w:t>
+      </w:r>
+    </w:p>
+    <w:p>
+      <w:r>
+        <w:t xml:space="preserve">            &lt;option value="insert"&gt;Insert New Transaction&lt;/option&gt;</w:t>
+      </w:r>
+    </w:p>
+    <w:p>
+      <w:r>
+        <w:t xml:space="preserve">            &lt;option value="update"&gt;Update Transaction&lt;/option&gt;</w:t>
+      </w:r>
+    </w:p>
+    <w:p>
+      <w:r>
+        <w:t xml:space="preserve">            &lt;option value="delete"&gt;Delete Transaction&lt;/option&gt;</w:t>
+      </w:r>
+    </w:p>
+    <w:p>
+      <w:r>
+        <w:t xml:space="preserve">        &lt;/select&gt;</w:t>
+      </w:r>
+    </w:p>
+    <w:p>
+      <w:r>
+        <w:t xml:space="preserve">    &lt;/div&gt;</w:t>
+      </w:r>
+    </w:p>
+    <w:p/>
+    <w:p>
+      <w:r>
+        <w:t xml:space="preserve">    &lt;div&gt;</w:t>
+      </w:r>
+    </w:p>
+    <w:p>
+      <w:r>
+        <w:t xml:space="preserve">        &lt;label for="</w:t>
+      </w:r>
+      <w:proofErr w:type="spellStart"/>
+      <w:r>
+        <w:t>transCode</w:t>
+      </w:r>
+      <w:proofErr w:type="spellEnd"/>
+      <w:r>
+        <w:t>"&gt;Transaction Code (Key):&lt;/label&gt;</w:t>
+      </w:r>
+    </w:p>
+    <w:p>
+      <w:r>
+        <w:t xml:space="preserve">        &lt;input type="text" id="</w:t>
+      </w:r>
+      <w:proofErr w:type="spellStart"/>
+      <w:r>
+        <w:t>transCode</w:t>
+      </w:r>
+      <w:proofErr w:type="spellEnd"/>
+      <w:r>
+        <w:t>" name="</w:t>
+      </w:r>
+      <w:proofErr w:type="spellStart"/>
+      <w:r>
+        <w:t>transCode</w:t>
+      </w:r>
+      <w:proofErr w:type="spellEnd"/>
+      <w:r>
+        <w:t>" placeholder="e.g. TXN-20260612-001" required&gt;</w:t>
+      </w:r>
+    </w:p>
+    <w:p>
+      <w:r>
+        <w:t xml:space="preserve">    &lt;/div&gt;</w:t>
+      </w:r>
+    </w:p>
+    <w:p/>
+    <w:p>
+      <w:r>
+        <w:t xml:space="preserve">    &lt;div id="</w:t>
+      </w:r>
+      <w:proofErr w:type="spellStart"/>
+      <w:r>
+        <w:t>dataFields</w:t>
+      </w:r>
+      <w:proofErr w:type="spellEnd"/>
+      <w:r>
+        <w:t>"&gt;</w:t>
+      </w:r>
+    </w:p>
+    <w:p>
+      <w:r>
+        <w:t xml:space="preserve">        &lt;div&gt;</w:t>
+      </w:r>
+    </w:p>
+    <w:p>
+      <w:r>
+        <w:t xml:space="preserve">            &lt;label for="username"&gt;Username:&lt;/label&gt;</w:t>
+      </w:r>
+    </w:p>
+    <w:p>
+      <w:r>
+        <w:t xml:space="preserve">            &lt;input type="text" id="username" name="username"&gt;</w:t>
+      </w:r>
+    </w:p>
+    <w:p>
+      <w:r>
+        <w:t xml:space="preserve">        &lt;/div&gt;</w:t>
+      </w:r>
+    </w:p>
+    <w:p>
+      <w:r>
+        <w:t xml:space="preserve">        &lt;div&gt;</w:t>
+      </w:r>
+    </w:p>
+    <w:p>
+      <w:r>
+        <w:t xml:space="preserve">            &lt;label for="description"&gt;Description:&lt;/label&gt;</w:t>
+      </w:r>
+    </w:p>
+    <w:p>
+      <w:r>
+        <w:t xml:space="preserve">            &lt;input type="text" id="description" name="description"&gt;</w:t>
+      </w:r>
+    </w:p>
+    <w:p>
+      <w:r>
+        <w:t xml:space="preserve">        &lt;/div&gt;</w:t>
+      </w:r>
+    </w:p>
+    <w:p>
+      <w:r>
+        <w:t xml:space="preserve">        &lt;div&gt;</w:t>
+      </w:r>
+    </w:p>
+    <w:p>
+      <w:r>
+        <w:t xml:space="preserve">            &lt;label for="</w:t>
+      </w:r>
+      <w:proofErr w:type="spellStart"/>
+      <w:r>
+        <w:t>transDate</w:t>
+      </w:r>
+      <w:proofErr w:type="spellEnd"/>
+      <w:r>
+        <w:t>"&gt;Transaction Date:&lt;/label&gt;</w:t>
+      </w:r>
+    </w:p>
+    <w:p>
+      <w:r>
+        <w:t xml:space="preserve">            &lt;input type="date" id="</w:t>
+      </w:r>
+      <w:proofErr w:type="spellStart"/>
+      <w:r>
+        <w:t>transDate</w:t>
+      </w:r>
+      <w:proofErr w:type="spellEnd"/>
+      <w:r>
+        <w:t>" name="</w:t>
+      </w:r>
+      <w:proofErr w:type="spellStart"/>
+      <w:r>
+        <w:t>transDate</w:t>
+      </w:r>
+      <w:proofErr w:type="spellEnd"/>
+      <w:r>
+        <w:t>"&gt;</w:t>
+      </w:r>
+    </w:p>
+    <w:p>
+      <w:r>
+        <w:t xml:space="preserve">        &lt;/div&gt;</w:t>
+      </w:r>
+    </w:p>
+    <w:p>
+      <w:r>
+        <w:t xml:space="preserve">        &lt;div&gt;</w:t>
+      </w:r>
+    </w:p>
+    <w:p>
+      <w:r>
+        <w:t xml:space="preserve">            &lt;label for="category"&gt;Category:&lt;/label&gt;</w:t>
+      </w:r>
+    </w:p>
+    <w:p>
+      <w:r>
+        <w:t xml:space="preserve">            &lt;select id="category" name="category"&gt;</w:t>
+      </w:r>
+    </w:p>
+    <w:p>
+      <w:r>
+        <w:t xml:space="preserve">                &lt;option value=""&gt;-- Select --&lt;/option&gt;</w:t>
+      </w:r>
+    </w:p>
+    <w:p>
+      <w:r>
+        <w:t xml:space="preserve">                &lt;option value="deposit"&gt;Deposit&lt;/option&gt;</w:t>
+      </w:r>
+    </w:p>
+    <w:p>
+      <w:r>
+        <w:t xml:space="preserve">                &lt;option value="withdrawal"&gt;Withdrawal&lt;/option&gt;</w:t>
+      </w:r>
+    </w:p>
+    <w:p>
+      <w:r>
+        <w:t xml:space="preserve">                &lt;option value="transfer"&gt;Transfer&lt;/option&gt;</w:t>
+      </w:r>
+    </w:p>
+    <w:p>
+      <w:r>
+        <w:t xml:space="preserve">                &lt;option value="payment"&gt;Payment&lt;/option&gt;</w:t>
+      </w:r>
+    </w:p>
+    <w:p>
+      <w:r>
+        <w:t xml:space="preserve">            &lt;/select&gt;</w:t>
+      </w:r>
+    </w:p>
+    <w:p>
+      <w:r>
+        <w:t xml:space="preserve">        &lt;/div&gt;</w:t>
+      </w:r>
+    </w:p>
+    <w:p>
+      <w:r>
+        <w:t xml:space="preserve">    &lt;/div&gt;</w:t>
+      </w:r>
+    </w:p>
+    <w:p/>
+    <w:p>
+      <w:r>
+        <w:t xml:space="preserve">    &lt;button type="submit" id="</w:t>
+      </w:r>
+      <w:proofErr w:type="spellStart"/>
+      <w:r>
+        <w:t>submitBtn</w:t>
+      </w:r>
+      <w:proofErr w:type="spellEnd"/>
+      <w:r>
+        <w:t>"&gt;Submit&lt;/button&gt;</w:t>
+      </w:r>
+    </w:p>
+    <w:p>
+      <w:r>
+        <w:t>&lt;/form&gt;</w:t>
+      </w:r>
+    </w:p>
+    <w:p/>
+    <w:p>
+      <w:r>
+        <w:t>&lt;div id="result"&gt;&lt;/div&gt;</w:t>
+      </w:r>
+    </w:p>
+    <w:p/>
+    <w:p>
+      <w:r>
+        <w:t>&lt;script&gt;</w:t>
+      </w:r>
+    </w:p>
+    <w:p>
+      <w:r>
+        <w:t>// JavaScript</w:t>
+      </w:r>
+    </w:p>
+    <w:p>
+      <w:proofErr w:type="gramStart"/>
+      <w:r>
+        <w:t>document.getElementById</w:t>
+      </w:r>
+      <w:proofErr w:type="gramEnd"/>
+      <w:r>
+        <w:t>('transactionForm'</w:t>
+      </w:r>
+      <w:proofErr w:type="gramStart"/>
+      <w:r>
+        <w:t>).addEventListener</w:t>
+      </w:r>
+      <w:proofErr w:type="gramEnd"/>
+      <w:r>
+        <w:t>('submit', async function(e) {</w:t>
+      </w:r>
+    </w:p>
+    <w:p>
+      <w:r>
+        <w:t xml:space="preserve">    </w:t>
+      </w:r>
+      <w:proofErr w:type="spellStart"/>
+      <w:proofErr w:type="gramStart"/>
+      <w:r>
+        <w:t>e.preventDefault</w:t>
+      </w:r>
+      <w:proofErr w:type="spellEnd"/>
+      <w:proofErr w:type="gramEnd"/>
+      <w:r>
+        <w:t>(</w:t>
+      </w:r>
+      <w:proofErr w:type="gramStart"/>
+      <w:r>
+        <w:t>);</w:t>
+      </w:r>
+      <w:proofErr w:type="gramEnd"/>
+    </w:p>
+    <w:p/>
+    <w:p>
+      <w:r>
+        <w:t xml:space="preserve">    const </w:t>
+      </w:r>
+      <w:proofErr w:type="spellStart"/>
+      <w:r>
+        <w:t>formData</w:t>
+      </w:r>
+      <w:proofErr w:type="spellEnd"/>
+      <w:r>
+        <w:t xml:space="preserve"> = new </w:t>
+      </w:r>
+      <w:proofErr w:type="spellStart"/>
+      <w:r>
+        <w:t>FormData</w:t>
+      </w:r>
+      <w:proofErr w:type="spellEnd"/>
+      <w:r>
+        <w:t>(this</w:t>
+      </w:r>
+      <w:proofErr w:type="gramStart"/>
+      <w:r>
+        <w:t>);</w:t>
+      </w:r>
+      <w:proofErr w:type="gramEnd"/>
+    </w:p>
+    <w:p>
+      <w:r>
+        <w:t xml:space="preserve">    const data = </w:t>
+      </w:r>
+      <w:proofErr w:type="spellStart"/>
+      <w:r>
+        <w:t>Object.fromEntries</w:t>
+      </w:r>
+      <w:proofErr w:type="spellEnd"/>
+      <w:r>
+        <w:t>(</w:t>
+      </w:r>
+      <w:proofErr w:type="spellStart"/>
+      <w:r>
+        <w:t>formData.entries</w:t>
+      </w:r>
+      <w:proofErr w:type="spellEnd"/>
+      <w:r>
+        <w:t>()</w:t>
+      </w:r>
+      <w:proofErr w:type="gramStart"/>
+      <w:r>
+        <w:t>);</w:t>
+      </w:r>
+      <w:proofErr w:type="gramEnd"/>
+    </w:p>
+    <w:p/>
+    <w:p>
+      <w:r>
+        <w:t xml:space="preserve">    try {</w:t>
+      </w:r>
+    </w:p>
+    <w:p>
+      <w:r>
+        <w:t xml:space="preserve">        const response = await </w:t>
+      </w:r>
+      <w:proofErr w:type="gramStart"/>
+      <w:r>
+        <w:t>fetch(</w:t>
+      </w:r>
+      <w:proofErr w:type="gramEnd"/>
+      <w:r>
+        <w:t>'</w:t>
+      </w:r>
+      <w:proofErr w:type="spellStart"/>
+      <w:r>
+        <w:t>process_transaction.php</w:t>
+      </w:r>
+      <w:proofErr w:type="spellEnd"/>
+      <w:r>
+        <w:t>', {</w:t>
+      </w:r>
+    </w:p>
+    <w:p>
+      <w:r>
+        <w:t xml:space="preserve">            method: 'POST',</w:t>
+      </w:r>
+    </w:p>
+    <w:p>
+      <w:r>
+        <w:t xml:space="preserve">            headers: </w:t>
+      </w:r>
+      <w:proofErr w:type="gramStart"/>
+      <w:r>
+        <w:t>{ '</w:t>
+      </w:r>
+      <w:proofErr w:type="gramEnd"/>
+      <w:r>
+        <w:t>Content-Type': 'application/</w:t>
+      </w:r>
+      <w:proofErr w:type="spellStart"/>
+      <w:r>
+        <w:t>json</w:t>
+      </w:r>
+      <w:proofErr w:type="spellEnd"/>
+      <w:proofErr w:type="gramStart"/>
+      <w:r>
+        <w:t>' }</w:t>
+      </w:r>
+      <w:proofErr w:type="gramEnd"/>
+      <w:r>
+        <w:t>,</w:t>
+      </w:r>
+    </w:p>
+    <w:p>
+      <w:r>
+        <w:t xml:space="preserve">            body: </w:t>
+      </w:r>
+      <w:proofErr w:type="spellStart"/>
+      <w:r>
+        <w:t>JSON.stringify</w:t>
+      </w:r>
+      <w:proofErr w:type="spellEnd"/>
+      <w:r>
+        <w:t>(data)</w:t>
+      </w:r>
+    </w:p>
+    <w:p>
+      <w:r>
+        <w:t xml:space="preserve">        });</w:t>
+      </w:r>
+    </w:p>
+    <w:p/>
+    <w:p>
+      <w:r>
+        <w:t xml:space="preserve">        const result = await </w:t>
+      </w:r>
+      <w:proofErr w:type="spellStart"/>
+      <w:proofErr w:type="gramStart"/>
+      <w:r>
+        <w:t>response.json</w:t>
+      </w:r>
+      <w:proofErr w:type="spellEnd"/>
+      <w:proofErr w:type="gramEnd"/>
+      <w:r>
+        <w:t>(</w:t>
+      </w:r>
+      <w:proofErr w:type="gramStart"/>
+      <w:r>
+        <w:t>);</w:t>
+      </w:r>
+      <w:proofErr w:type="gramEnd"/>
+    </w:p>
+    <w:p>
+      <w:r>
+        <w:t xml:space="preserve">        const </w:t>
+      </w:r>
+      <w:proofErr w:type="spellStart"/>
+      <w:r>
+        <w:t>resultDiv</w:t>
+      </w:r>
+      <w:proofErr w:type="spellEnd"/>
+      <w:r>
+        <w:t xml:space="preserve"> = </w:t>
+      </w:r>
+      <w:proofErr w:type="spellStart"/>
+      <w:proofErr w:type="gramStart"/>
+      <w:r>
+        <w:t>document.getElementById</w:t>
+      </w:r>
+      <w:proofErr w:type="spellEnd"/>
+      <w:proofErr w:type="gramEnd"/>
+      <w:r>
+        <w:t>('result'</w:t>
+      </w:r>
+      <w:proofErr w:type="gramStart"/>
+      <w:r>
+        <w:t>);</w:t>
+      </w:r>
+      <w:proofErr w:type="gramEnd"/>
+    </w:p>
+    <w:p/>
+    <w:p>
+      <w:r>
+        <w:t xml:space="preserve">        if (</w:t>
+      </w:r>
+      <w:proofErr w:type="spellStart"/>
+      <w:proofErr w:type="gramStart"/>
+      <w:r>
+        <w:t>result.code</w:t>
+      </w:r>
+      <w:proofErr w:type="spellEnd"/>
+      <w:proofErr w:type="gramEnd"/>
+      <w:r>
+        <w:t xml:space="preserve"> === 200) {</w:t>
+      </w:r>
+    </w:p>
+    <w:p>
+      <w:r>
+        <w:t xml:space="preserve">            </w:t>
+      </w:r>
+      <w:proofErr w:type="spellStart"/>
+      <w:proofErr w:type="gramStart"/>
+      <w:r>
+        <w:t>resultDiv.style.borderColor</w:t>
+      </w:r>
+      <w:proofErr w:type="spellEnd"/>
+      <w:proofErr w:type="gramEnd"/>
+      <w:r>
+        <w:t xml:space="preserve"> = 'green</w:t>
+      </w:r>
+      <w:proofErr w:type="gramStart"/>
+      <w:r>
+        <w:t>';</w:t>
+      </w:r>
+      <w:proofErr w:type="gramEnd"/>
+    </w:p>
+    <w:p>
+      <w:r>
+        <w:t xml:space="preserve">            </w:t>
+      </w:r>
+      <w:proofErr w:type="spellStart"/>
+      <w:r>
+        <w:t>resultDiv.innerHTML</w:t>
+      </w:r>
+      <w:proofErr w:type="spellEnd"/>
+      <w:r>
+        <w:t xml:space="preserve"> = `&lt;strong&gt;</w:t>
+      </w:r>
+      <w:proofErr w:type="gramStart"/>
+      <w:r>
+        <w:t>Success!&lt;</w:t>
+      </w:r>
+      <w:proofErr w:type="gramEnd"/>
+      <w:r>
+        <w:t>/strong&gt; ${</w:t>
+      </w:r>
+      <w:proofErr w:type="spellStart"/>
+      <w:proofErr w:type="gramStart"/>
+      <w:r>
+        <w:t>result.message</w:t>
+      </w:r>
+      <w:proofErr w:type="spellEnd"/>
+      <w:proofErr w:type="gramEnd"/>
+      <w:r>
+        <w:t>}</w:t>
+      </w:r>
+      <w:proofErr w:type="gramStart"/>
+      <w:r>
+        <w:t>`;</w:t>
+      </w:r>
+      <w:proofErr w:type="gramEnd"/>
+    </w:p>
+    <w:p>
+      <w:r>
+        <w:t xml:space="preserve">        } else {</w:t>
+      </w:r>
+    </w:p>
+    <w:p>
+      <w:r>
+        <w:t xml:space="preserve">            </w:t>
+      </w:r>
+      <w:proofErr w:type="spellStart"/>
+      <w:proofErr w:type="gramStart"/>
+      <w:r>
+        <w:t>resultDiv.style.borderColor</w:t>
+      </w:r>
+      <w:proofErr w:type="spellEnd"/>
+      <w:proofErr w:type="gramEnd"/>
+      <w:r>
+        <w:t xml:space="preserve"> = 'red</w:t>
+      </w:r>
+      <w:proofErr w:type="gramStart"/>
+      <w:r>
+        <w:t>';</w:t>
+      </w:r>
+      <w:proofErr w:type="gramEnd"/>
+    </w:p>
+    <w:p>
+      <w:r>
+        <w:t xml:space="preserve">            </w:t>
+      </w:r>
+      <w:proofErr w:type="spellStart"/>
+      <w:r>
+        <w:t>resultDiv.innerHTML</w:t>
+      </w:r>
+      <w:proofErr w:type="spellEnd"/>
+      <w:r>
+        <w:t xml:space="preserve"> = `&lt;strong&gt;Error (${</w:t>
+      </w:r>
+      <w:proofErr w:type="spellStart"/>
+      <w:proofErr w:type="gramStart"/>
+      <w:r>
+        <w:t>result.code</w:t>
+      </w:r>
+      <w:proofErr w:type="spellEnd"/>
+      <w:r>
+        <w:t>})&lt;</w:t>
+      </w:r>
+      <w:proofErr w:type="gramEnd"/>
+      <w:r>
+        <w:t>/strong&gt; ${</w:t>
+      </w:r>
+      <w:proofErr w:type="spellStart"/>
+      <w:proofErr w:type="gramStart"/>
+      <w:r>
+        <w:t>result.message</w:t>
+      </w:r>
+      <w:proofErr w:type="spellEnd"/>
+      <w:proofErr w:type="gramEnd"/>
+      <w:r>
+        <w:t>}</w:t>
+      </w:r>
+      <w:proofErr w:type="gramStart"/>
+      <w:r>
+        <w:t>`;</w:t>
+      </w:r>
+      <w:proofErr w:type="gramEnd"/>
+    </w:p>
+    <w:p>
+      <w:r>
+        <w:t xml:space="preserve">        }</w:t>
+      </w:r>
+    </w:p>
+    <w:p>
+      <w:r>
+        <w:t xml:space="preserve">    } catch (error) {</w:t>
+      </w:r>
+    </w:p>
+    <w:p>
+      <w:r>
+        <w:t xml:space="preserve">        </w:t>
+      </w:r>
+      <w:proofErr w:type="spellStart"/>
+      <w:proofErr w:type="gramStart"/>
+      <w:r>
+        <w:t>document.getElementById</w:t>
+      </w:r>
+      <w:proofErr w:type="spellEnd"/>
+      <w:proofErr w:type="gramEnd"/>
+      <w:r>
+        <w:t>('result'</w:t>
+      </w:r>
+      <w:proofErr w:type="gramStart"/>
+      <w:r>
+        <w:t>).</w:t>
+      </w:r>
+      <w:proofErr w:type="spellStart"/>
+      <w:r>
+        <w:t>innerHTML</w:t>
+      </w:r>
+      <w:proofErr w:type="spellEnd"/>
+      <w:proofErr w:type="gramEnd"/>
+      <w:r>
+        <w:t xml:space="preserve"> = '&lt;strong style="</w:t>
+      </w:r>
+      <w:proofErr w:type="spellStart"/>
+      <w:proofErr w:type="gramStart"/>
+      <w:r>
+        <w:t>color:red</w:t>
+      </w:r>
+      <w:proofErr w:type="spellEnd"/>
+      <w:proofErr w:type="gramEnd"/>
+      <w:r>
+        <w:t xml:space="preserve">"&gt;Network </w:t>
+      </w:r>
+      <w:proofErr w:type="gramStart"/>
+      <w:r>
+        <w:t>error.&lt;</w:t>
+      </w:r>
+      <w:proofErr w:type="gramEnd"/>
+      <w:r>
+        <w:t>/strong&gt;</w:t>
+      </w:r>
+      <w:proofErr w:type="gramStart"/>
+      <w:r>
+        <w:t>';</w:t>
+      </w:r>
+      <w:proofErr w:type="gramEnd"/>
+    </w:p>
+    <w:p>
+      <w:r>
+        <w:t xml:space="preserve">    }</w:t>
+      </w:r>
+    </w:p>
+    <w:p>
+      <w:r>
+        <w:t>});</w:t>
+      </w:r>
+    </w:p>
+    <w:p/>
+    <w:p>
+      <w:r>
+        <w:t>// Show/hide fields based on operation</w:t>
+      </w:r>
+    </w:p>
+    <w:p>
+      <w:proofErr w:type="spellStart"/>
+      <w:proofErr w:type="gramStart"/>
+      <w:r>
+        <w:t>document.getElementById</w:t>
+      </w:r>
+      <w:proofErr w:type="spellEnd"/>
+      <w:proofErr w:type="gramEnd"/>
+      <w:r>
+        <w:t>('operation'</w:t>
+      </w:r>
+      <w:proofErr w:type="gramStart"/>
+      <w:r>
+        <w:t>).</w:t>
+      </w:r>
+      <w:proofErr w:type="spellStart"/>
+      <w:r>
+        <w:t>addEventListener</w:t>
+      </w:r>
+      <w:proofErr w:type="spellEnd"/>
+      <w:proofErr w:type="gramEnd"/>
+      <w:r>
+        <w:t xml:space="preserve">('change', </w:t>
+      </w:r>
+      <w:proofErr w:type="gramStart"/>
+      <w:r>
+        <w:t>function(</w:t>
+      </w:r>
+      <w:proofErr w:type="gramEnd"/>
+      <w:r>
+        <w:t>) {</w:t>
+      </w:r>
+    </w:p>
+    <w:p>
+      <w:r>
+        <w:t xml:space="preserve">    const </w:t>
+      </w:r>
+      <w:proofErr w:type="spellStart"/>
+      <w:r>
+        <w:t>dataFields</w:t>
+      </w:r>
+      <w:proofErr w:type="spellEnd"/>
+      <w:r>
+        <w:t xml:space="preserve"> = </w:t>
+      </w:r>
+      <w:proofErr w:type="spellStart"/>
+      <w:proofErr w:type="gramStart"/>
+      <w:r>
+        <w:t>document.getElementById</w:t>
+      </w:r>
+      <w:proofErr w:type="spellEnd"/>
+      <w:proofErr w:type="gramEnd"/>
+      <w:r>
+        <w:t>('</w:t>
+      </w:r>
+      <w:proofErr w:type="spellStart"/>
+      <w:r>
+        <w:t>dataFields</w:t>
+      </w:r>
+      <w:proofErr w:type="spellEnd"/>
+      <w:r>
+        <w:t>'</w:t>
+      </w:r>
+      <w:proofErr w:type="gramStart"/>
+      <w:r>
+        <w:t>);</w:t>
+      </w:r>
+      <w:proofErr w:type="gramEnd"/>
+    </w:p>
+    <w:p>
+      <w:r>
+        <w:t xml:space="preserve">    const </w:t>
+      </w:r>
+      <w:proofErr w:type="spellStart"/>
+      <w:r>
+        <w:t>submitBtn</w:t>
+      </w:r>
+      <w:proofErr w:type="spellEnd"/>
+      <w:r>
+        <w:t xml:space="preserve"> = </w:t>
+      </w:r>
+      <w:proofErr w:type="spellStart"/>
+      <w:proofErr w:type="gramStart"/>
+      <w:r>
+        <w:t>document.getElementById</w:t>
+      </w:r>
+      <w:proofErr w:type="spellEnd"/>
+      <w:proofErr w:type="gramEnd"/>
+      <w:r>
+        <w:t>('</w:t>
+      </w:r>
+      <w:proofErr w:type="spellStart"/>
+      <w:r>
+        <w:t>submitBtn</w:t>
+      </w:r>
+      <w:proofErr w:type="spellEnd"/>
+      <w:r>
+        <w:t>'</w:t>
+      </w:r>
+      <w:proofErr w:type="gramStart"/>
+      <w:r>
+        <w:t>);</w:t>
+      </w:r>
+      <w:proofErr w:type="gramEnd"/>
+    </w:p>
+    <w:p/>
+    <w:p>
+      <w:r>
+        <w:t xml:space="preserve">    if (</w:t>
+      </w:r>
+      <w:proofErr w:type="spellStart"/>
+      <w:r>
+        <w:t>this.value</w:t>
+      </w:r>
+      <w:proofErr w:type="spellEnd"/>
+      <w:r>
+        <w:t xml:space="preserve"> === 'delete') {</w:t>
+      </w:r>
+    </w:p>
+    <w:p>
+      <w:r>
+        <w:t xml:space="preserve">        </w:t>
+      </w:r>
+      <w:proofErr w:type="spellStart"/>
+      <w:proofErr w:type="gramStart"/>
+      <w:r>
+        <w:t>dataFields.style.display</w:t>
+      </w:r>
+      <w:proofErr w:type="spellEnd"/>
+      <w:proofErr w:type="gramEnd"/>
+      <w:r>
+        <w:t xml:space="preserve"> = 'none</w:t>
+      </w:r>
+      <w:proofErr w:type="gramStart"/>
+      <w:r>
+        <w:t>';</w:t>
+      </w:r>
+      <w:proofErr w:type="gramEnd"/>
+    </w:p>
+    <w:p>
+      <w:r>
+        <w:t xml:space="preserve">        </w:t>
+      </w:r>
+      <w:proofErr w:type="spellStart"/>
+      <w:r>
+        <w:t>submitBtn.classList.add</w:t>
+      </w:r>
+      <w:proofErr w:type="spellEnd"/>
+      <w:r>
+        <w:t>('delete-</w:t>
+      </w:r>
+      <w:proofErr w:type="spellStart"/>
+      <w:r>
+        <w:t>btn</w:t>
+      </w:r>
+      <w:proofErr w:type="spellEnd"/>
+      <w:r>
+        <w:t>'</w:t>
+      </w:r>
+      <w:proofErr w:type="gramStart"/>
+      <w:r>
+        <w:t>);</w:t>
+      </w:r>
+      <w:proofErr w:type="gramEnd"/>
+    </w:p>
+    <w:p>
+      <w:r>
+        <w:t xml:space="preserve">        </w:t>
+      </w:r>
+      <w:proofErr w:type="spellStart"/>
+      <w:r>
+        <w:t>submitBtn.textContent</w:t>
+      </w:r>
+      <w:proofErr w:type="spellEnd"/>
+      <w:r>
+        <w:t xml:space="preserve"> = 'Delete Transaction</w:t>
+      </w:r>
+      <w:proofErr w:type="gramStart"/>
+      <w:r>
+        <w:t>';</w:t>
+      </w:r>
+      <w:proofErr w:type="gramEnd"/>
+    </w:p>
+    <w:p>
+      <w:r>
+        <w:t xml:space="preserve">    } else {</w:t>
+      </w:r>
+    </w:p>
+    <w:p>
+      <w:r>
+        <w:t xml:space="preserve">        </w:t>
+      </w:r>
+      <w:proofErr w:type="spellStart"/>
+      <w:proofErr w:type="gramStart"/>
+      <w:r>
+        <w:t>dataFields.style.display</w:t>
+      </w:r>
+      <w:proofErr w:type="spellEnd"/>
+      <w:proofErr w:type="gramEnd"/>
+      <w:r>
+        <w:t xml:space="preserve"> = 'grid</w:t>
+      </w:r>
+      <w:proofErr w:type="gramStart"/>
+      <w:r>
+        <w:t>';</w:t>
+      </w:r>
+      <w:proofErr w:type="gramEnd"/>
+    </w:p>
+    <w:p>
+      <w:r>
+        <w:t xml:space="preserve">        </w:t>
+      </w:r>
+      <w:proofErr w:type="spellStart"/>
+      <w:proofErr w:type="gramStart"/>
+      <w:r>
+        <w:t>submitBtn.classList.remove</w:t>
+      </w:r>
+      <w:proofErr w:type="spellEnd"/>
+      <w:proofErr w:type="gramEnd"/>
+      <w:r>
+        <w:t>('delete-</w:t>
+      </w:r>
+      <w:proofErr w:type="spellStart"/>
+      <w:r>
+        <w:t>btn</w:t>
+      </w:r>
+      <w:proofErr w:type="spellEnd"/>
+      <w:r>
+        <w:t>'</w:t>
+      </w:r>
+      <w:proofErr w:type="gramStart"/>
+      <w:r>
+        <w:t>);</w:t>
+      </w:r>
+      <w:proofErr w:type="gramEnd"/>
+    </w:p>
+    <w:p>
+      <w:r>
+        <w:t xml:space="preserve">        </w:t>
+      </w:r>
+      <w:proofErr w:type="spellStart"/>
+      <w:r>
+        <w:t>submitBtn.textContent</w:t>
+      </w:r>
+      <w:proofErr w:type="spellEnd"/>
+      <w:r>
+        <w:t xml:space="preserve"> = </w:t>
+      </w:r>
+      <w:proofErr w:type="spellStart"/>
+      <w:r>
+        <w:t>this.value</w:t>
+      </w:r>
+      <w:proofErr w:type="spellEnd"/>
+      <w:r>
+        <w:t xml:space="preserve"> === 'insert</w:t>
+      </w:r>
+      <w:proofErr w:type="gramStart"/>
+      <w:r>
+        <w:t>' ?</w:t>
+      </w:r>
+      <w:proofErr w:type="gramEnd"/>
+      <w:r>
+        <w:t xml:space="preserve"> 'Insert Transaction</w:t>
+      </w:r>
+      <w:proofErr w:type="gramStart"/>
+      <w:r>
+        <w:t>' :</w:t>
+      </w:r>
+      <w:proofErr w:type="gramEnd"/>
+      <w:r>
+        <w:t xml:space="preserve"> 'Update Transaction</w:t>
+      </w:r>
+      <w:proofErr w:type="gramStart"/>
+      <w:r>
+        <w:t>';</w:t>
+      </w:r>
+      <w:proofErr w:type="gramEnd"/>
+    </w:p>
+    <w:p>
+      <w:r>
+        <w:t xml:space="preserve">    }</w:t>
+      </w:r>
+    </w:p>
+    <w:p>
+      <w:r>
+        <w:t>});</w:t>
+      </w:r>
+    </w:p>
+    <w:p/>
+    <w:p>
+      <w:r>
+        <w:t>// Set default date</w:t>
+      </w:r>
+    </w:p>
+    <w:p>
+      <w:proofErr w:type="spellStart"/>
+      <w:proofErr w:type="gramStart"/>
+      <w:r>
+        <w:t>document.getElementById</w:t>
+      </w:r>
+      <w:proofErr w:type="spellEnd"/>
+      <w:proofErr w:type="gramEnd"/>
+      <w:r>
+        <w:t>('</w:t>
+      </w:r>
+      <w:proofErr w:type="spellStart"/>
+      <w:r>
+        <w:t>transDate</w:t>
+      </w:r>
+      <w:proofErr w:type="spellEnd"/>
+      <w:r>
+        <w:t>').value = new Date(</w:t>
+      </w:r>
+      <w:proofErr w:type="gramStart"/>
+      <w:r>
+        <w:t>).</w:t>
+      </w:r>
+      <w:proofErr w:type="spellStart"/>
+      <w:r>
+        <w:t>toISOString</w:t>
+      </w:r>
+      <w:proofErr w:type="spellEnd"/>
+      <w:proofErr w:type="gramEnd"/>
+      <w:r>
+        <w:t>(</w:t>
+      </w:r>
+      <w:proofErr w:type="gramStart"/>
+      <w:r>
+        <w:t>).split</w:t>
+      </w:r>
+      <w:proofErr w:type="gramEnd"/>
+      <w:r>
+        <w:t>('T</w:t>
+      </w:r>
+      <w:proofErr w:type="gramStart"/>
+      <w:r>
+        <w:t>')[</w:t>
+      </w:r>
+      <w:proofErr w:type="gramEnd"/>
+      <w:r>
+        <w:t>0</w:t>
+      </w:r>
+      <w:proofErr w:type="gramStart"/>
+      <w:r>
+        <w:t>];</w:t>
+      </w:r>
+      <w:proofErr w:type="gramEnd"/>
+    </w:p>
+    <w:p>
+      <w:r>
+        <w:t>&lt;/script&gt;</w:t>
+      </w:r>
+    </w:p>
+    <w:p/>
+    <w:p>
+      <w:r>
+        <w:t>&lt;/body&gt;</w:t>
+      </w:r>
+    </w:p>
+    <w:p>
+      <w:r>
+        <w:t>&lt;/html&gt;</w:t>
+      </w:r>
+    </w:p>
+    <w:p>
+      <w:r>
+        <w:rPr>
+          <w:rFonts w:ascii="Times New Roman" w:hAnsi="Times New Roman" w:cs="Times New Roman"/>
+          <w:b/>
+          <w:bCs/>
+          <w:color w:val="000000"/>
+          <w:spacing w:val="-2"/>
+          <w:kern w:val="1"/>
+          <w:sz w:val="48"/>
+          <w:szCs w:val="48"/>
+        </w:rPr>
+        <w:t>2. Enhanced PHP Backend (</w:t>
+      </w:r>
+      <w:proofErr w:type="spellStart"/>
+      <w:r>
+        <w:rPr>
+          <w:rFonts w:ascii="System Font" w:hAnsi="System Font" w:cs="System Font"/>
+          <w:color w:val="FF5400"/>
+          <w:spacing w:val="-2"/>
+          <w:kern w:val="1"/>
+          <w:sz w:val="48"/>
+          <w:szCs w:val="48"/>
+        </w:rPr>
+        <w:t>process_transaction.php</w:t>
+      </w:r>
+      <w:proofErr w:type="spellEnd"/>
+      <w:r>
+        <w:rPr>
+          <w:rFonts w:ascii="Times New Roman" w:hAnsi="Times New Roman" w:cs="Times New Roman"/>
+          <w:b/>
+          <w:bCs/>
+          <w:color w:val="000000"/>
+          <w:spacing w:val="-2"/>
+          <w:kern w:val="1"/>
+          <w:sz w:val="48"/>
+          <w:szCs w:val="48"/>
+        </w:rPr>
+        <w:t>)</w:t>
       </w:r>
       <w:r>
         <w:br/>

</xml_diff>